<commit_message>
Promptar: liten tankbil, gjorda bilder (traktor11, hjullastare) borttagna
Co-Authored-By: Claude Opus 5.5 (1M context) <noreply@anthropic.com>
Claude-Session: https://claude.ai/code/session_01DXzJ89FjnLPJcbSPrq5dqA
</commit_message>
<xml_diff>
--- a/promptar/bilder.docx
+++ b/promptar/bilder.docx
@@ -76,81 +76,7 @@
         <w:pStyle w:val="Heading1"/>
       </w:pPr>
       <w:r>
-        <w:t>Bild 1: Traktor med släp  (traktor11.png)</w:t>
-      </w:r>
-    </w:p>
-    <w:p>
-      <w:r>
-        <w:rPr>
-          <w:rFonts w:ascii="Consolas" w:hAnsi="Consolas"/>
-          <w:sz w:val="19"/>
-        </w:rPr>
-        <w:t>A playful but slightly more realistic picture-book illustration for small children: a big modern farm tractor pulling a flat trailer loaded with large round hay bales, driving along a dirt road between green fields on a sunny summer day, seen from the side at a slight three-quarter angle. Realistic proportions: a tractor with a cab with big windows, big back wheels and smaller front wheels, a flat wooden trailer with two wheels carrying three or four round hay bales, but still friendly and softly rounded, not a toy. Landscape format 3:2, wider than tall, the whole tractor and the whole trailer visible with free space all around.</w:t>
-        <w:br/>
-        <w:br/>
-        <w:t>Style rules (important):</w:t>
-        <w:br/>
-        <w:t>- Bold, clean, smooth outlines in near-black around EVERY shape, all the same thickness, in the foreground AND the background: fields, hills, trees, the barn, the fence, the dirt road, clouds, the sun and each sun ray all get the same bold outline. No thin, light or colored lines anywhere.</w:t>
-        <w:br/>
-        <w:t>- Every area must be fully closed by outlines, no gaps. Stripes on the tractor and the round ends of the hay bales are separate areas with their own outlines.</w:t>
-        <w:br/>
-        <w:t>- The hay bales are smooth, simple shapes in soft golden yellow, with at most two or three bold spiral lines on the round ends. No individual straws, no hairy texture.</w:t>
-        <w:br/>
-        <w:t>- The dirt road is one plain area with no stones, no ruts and no tire tracks. The fields are large simple areas, no rows of crops.</w:t>
-        <w:br/>
-        <w:t>- Only the outlines are black. All fill colors are lighter: tires and dark parts are medium gray, never black or dark navy.</w:t>
-        <w:br/>
-        <w:t>- Mostly flat colors: each area has one main color with at most a very soft, light highlight. No strong gradients, no shading bands, no dark shadows along outlines, no shadows on the ground under the vehicles.</w:t>
-        <w:br/>
-        <w:t>- A bit more detail than a toy (cab windows with a seat and steering wheel, an exhaust pipe, headlights, a step, a colored stripe on the hood, tire treads with a few large blocks), but no tiny enclosed areas. No grilles with many slots, no ribbed or accordion details, no panel lines, bolts or rivets, no tiny chain links.</w:t>
-        <w:br/>
-        <w:t>- Background: soft rolling green hills, a red barn, a simple wooden fence, a big rounded bush or tree near the tractor, light blue sky with a few big puffy clouds and a sun. Keep background objects large and simple, no other vehicles.</w:t>
-        <w:br/>
-        <w:t>- No people, no animals, no text, no letters, no numbers, no logos, no frame, no signature, no paper texture.</w:t>
-      </w:r>
-    </w:p>
-    <w:p>
-      <w:pPr>
-        <w:pStyle w:val="Heading1"/>
-      </w:pPr>
-      <w:r>
-        <w:t>Bild 2: Hjullastare  (hjullastare.png)</w:t>
-      </w:r>
-    </w:p>
-    <w:p>
-      <w:r>
-        <w:rPr>
-          <w:rFonts w:ascii="Consolas" w:hAnsi="Consolas"/>
-          <w:sz w:val="19"/>
-        </w:rPr>
-        <w:t>A playful but slightly more realistic picture-book illustration for small children: a big yellow wheel loader at a construction site, lifting a bucket full of sand next to a big sand pile, seen from the side at a slight three-quarter angle. Realistic proportions: a wheel loader with a cab with big windows, four big wheels, a long articulated body, a big front bucket on two lift arms, but still friendly and softly rounded, not a toy. Landscape format 3:2, wider than tall, the whole wheel loader visible with free space all around.</w:t>
-        <w:br/>
-        <w:br/>
-        <w:t>Style rules (important):</w:t>
-        <w:br/>
-        <w:t>- Bold, clean, smooth outlines in near-black around EVERY shape, all the same thickness, in the foreground AND the background: the sand pile, the building under construction, the fence, traffic cones, the ground, clouds, the sun and each sun ray all get the same bold outline. No thin, light or colored lines anywhere.</w:t>
-        <w:br/>
-        <w:t>- Every area must be fully closed by outlines, no gaps. Stripes and warning patterns on the loader are separate areas with their own outlines.</w:t>
-        <w:br/>
-        <w:t>- The ground is one plain area of soft sandy beige, no tire tracks, no stones, no paving tiles. Sand and gravel are large smooth shapes in soft sandy beige, no single stones, no pebbles, no grainy texture, no flying dust.</w:t>
-        <w:br/>
-        <w:t>- Only the outlines are black. All fill colors are lighter: tires, the lift arms' dark parts and the hydraulic cylinders are medium gray, never black or dark navy.</w:t>
-        <w:br/>
-        <w:t>- Mostly flat colors: each area has one main color with at most a very soft, light highlight. No strong gradients, no shading bands, no dark shadows along outlines, no shadows on the ground under the vehicle.</w:t>
-        <w:br/>
-        <w:t>- A bit more detail than a toy (an orange beacon on the cab roof, side mirrors, headlights, steps up to the cab, tire treads with a few large blocks), but no tiny enclosed areas. No grilles with many slots, no ribbed or accordion details, no panel lines, bolts or rivets, no tiny chain links.</w:t>
-        <w:br/>
-        <w:t>- Background: a simple half-built house with big window openings, a simple fence, two or three traffic cones, a big rounded bush, light blue sky with a few big puffy clouds and a sun. Keep background objects large and simple, no other vehicles.</w:t>
-        <w:br/>
-        <w:t>- No people, no animals, no text, no letters, no numbers, no logos, no frame, no signature, no paper texture.</w:t>
-      </w:r>
-    </w:p>
-    <w:p>
-      <w:pPr>
-        <w:pStyle w:val="Heading1"/>
-      </w:pPr>
-      <w:r>
-        <w:t>Bild 3: Grävmaskin  (gravare6.png)</w:t>
+        <w:t>Bild 1: Grävmaskin  (gravare6.png)</w:t>
       </w:r>
     </w:p>
     <w:p>
@@ -188,7 +114,7 @@
         <w:pStyle w:val="Heading1"/>
       </w:pPr>
       <w:r>
-        <w:t>Bild 4: Dumper  (dumper5.png)</w:t>
+        <w:t>Bild 2: Dumper  (dumper5.png)</w:t>
       </w:r>
     </w:p>
     <w:p>
@@ -224,7 +150,7 @@
         <w:pStyle w:val="Heading1"/>
       </w:pPr>
       <w:r>
-        <w:t>Bild 5: Betongbil  (betongbil6.png)</w:t>
+        <w:t>Bild 3: Betongbil  (betongbil6.png)</w:t>
       </w:r>
     </w:p>
     <w:p>
@@ -260,7 +186,7 @@
         <w:pStyle w:val="Heading1"/>
       </w:pPr>
       <w:r>
-        <w:t>Bild 6: Kranbil  (kranbil4.png)</w:t>
+        <w:t>Bild 4: Kranbil  (kranbil4.png)</w:t>
       </w:r>
     </w:p>
     <w:p>
@@ -298,7 +224,7 @@
         <w:pStyle w:val="Heading1"/>
       </w:pPr>
       <w:r>
-        <w:t>Bild 7: Skördetröska  (skordetroska2.png)</w:t>
+        <w:t>Bild 5: Skördetröska  (skordetroska2.png)</w:t>
       </w:r>
     </w:p>
     <w:p>
@@ -336,7 +262,7 @@
         <w:pStyle w:val="Heading1"/>
       </w:pPr>
       <w:r>
-        <w:t>Bild 8: Polisbil  (polisbil6.png)</w:t>
+        <w:t>Bild 6: Polisbil  (polisbil6.png)</w:t>
       </w:r>
     </w:p>
     <w:p>
@@ -372,7 +298,7 @@
         <w:pStyle w:val="Heading1"/>
       </w:pPr>
       <w:r>
-        <w:t>Bild 9: Ambulans  (ambulans6.png)</w:t>
+        <w:t>Bild 7: Ambulans  (ambulans6.png)</w:t>
       </w:r>
     </w:p>
     <w:p>
@@ -408,7 +334,7 @@
         <w:pStyle w:val="Heading1"/>
       </w:pPr>
       <w:r>
-        <w:t>Bild 10: Brandbil  (brandbil6.png)</w:t>
+        <w:t>Bild 8: Brandbil  (brandbil6.png)</w:t>
       </w:r>
     </w:p>
     <w:p>
@@ -444,7 +370,45 @@
         <w:pStyle w:val="Heading1"/>
       </w:pPr>
       <w:r>
-        <w:t>Bild 11: Sopbil  (sopbil8.png)</w:t>
+        <w:t>Bild 9: Liten tankbil  (tankbil.png)</w:t>
+      </w:r>
+    </w:p>
+    <w:p>
+      <w:r>
+        <w:rPr>
+          <w:rFonts w:ascii="Consolas" w:hAnsi="Consolas"/>
+          <w:sz w:val="19"/>
+        </w:rPr>
+        <w:t>A playful but slightly more realistic picture-book illustration for small children: a small tanker truck driving along a street in a small town, seen from the side at a slight three-quarter angle. Realistic proportions: a short, small tanker truck with a cab with a big windshield and side window, one big rounded oval tank on the back with a small hatch on top, a hose rolled up at the back, two wheels on each side, but still friendly and softly rounded, not a toy. Landscape format 3:2, wider than tall, the whole tanker truck visible with free space all around.</w:t>
+        <w:br/>
+        <w:br/>
+        <w:t>Style rules (important):</w:t>
+        <w:br/>
+        <w:t>- Bold, clean, smooth outlines in near-black around EVERY shape, all the same thickness, in the foreground AND the background: houses, trees, the street, the curb, road markings, clouds, the sun and each sun ray all get the same bold outline. No thin, light or colored lines anywhere.</w:t>
+        <w:br/>
+        <w:t>- Every area must be fully closed by outlines, no gaps. The colored stripe around the tank and the stripe along the cab are separate areas with their own outlines.</w:t>
+        <w:br/>
+        <w:t>- The street is one plain area with a few wide outlined markings, no paving tiles, no cobblestones, no grid of lines on the ground.</w:t>
+        <w:br/>
+        <w:t>- The tank is one smooth rounded shape with only one or two wide colored bands, no ribs, no rivets, no reflections.</w:t>
+        <w:br/>
+        <w:t>- Only the outlines are black. All fill colors are lighter: tires and dark parts are medium gray, never black or dark navy.</w:t>
+        <w:br/>
+        <w:t>- Mostly flat colors: each area has one main color with at most a very soft, light highlight. No strong gradients, no shading bands, no dark shadows along outlines, no shadows on the ground under the vehicle.</w:t>
+        <w:br/>
+        <w:t>- A bit more detail than a toy (a beacon on the cab roof, side mirrors, headlights, a step, a small ladder at the back of the tank), but no tiny enclosed areas. No grilles with many slots, no ribbed or accordion details, no panel lines, bolts or rivets, no tiny chain links.</w:t>
+        <w:br/>
+        <w:t>- Background: a few simple houses with big windows, a big rounded bush or tree near the truck, light blue sky with a few big puffy clouds and a sun. Keep background objects large and simple, no other vehicles.</w:t>
+        <w:br/>
+        <w:t>- No people, no animals, no text, no letters, no numbers, no logos, no frame, no signature, no paper texture.</w:t>
+      </w:r>
+    </w:p>
+    <w:p>
+      <w:pPr>
+        <w:pStyle w:val="Heading1"/>
+      </w:pPr>
+      <w:r>
+        <w:t>Bild 10: Sopbil  (sopbil8.png)</w:t>
       </w:r>
     </w:p>
     <w:p>
@@ -480,7 +444,7 @@
         <w:pStyle w:val="Heading1"/>
       </w:pPr>
       <w:r>
-        <w:t>Bild 12: Postbil  (postbil2.png)</w:t>
+        <w:t>Bild 11: Postbil  (postbil2.png)</w:t>
       </w:r>
     </w:p>
     <w:p>
@@ -516,7 +480,7 @@
         <w:pStyle w:val="Heading1"/>
       </w:pPr>
       <w:r>
-        <w:t>Bild 13: Buss  (buss4.png)</w:t>
+        <w:t>Bild 12: Buss  (buss4.png)</w:t>
       </w:r>
     </w:p>
     <w:p>
@@ -552,7 +516,7 @@
         <w:pStyle w:val="Heading1"/>
       </w:pPr>
       <w:r>
-        <w:t>Bild 14: Tåg  (tag3.png)</w:t>
+        <w:t>Bild 13: Tåg  (tag3.png)</w:t>
       </w:r>
     </w:p>
     <w:p>
@@ -588,7 +552,7 @@
         <w:pStyle w:val="Heading1"/>
       </w:pPr>
       <w:r>
-        <w:t>Bild 15: Litet flygplan  (flygplan7.png)</w:t>
+        <w:t>Bild 14: Litet flygplan  (flygplan7.png)</w:t>
       </w:r>
     </w:p>
     <w:p>
@@ -624,7 +588,7 @@
         <w:pStyle w:val="Heading1"/>
       </w:pPr>
       <w:r>
-        <w:t>Bild 16: Helikopter  (helikopter4.png)</w:t>
+        <w:t>Bild 15: Helikopter  (helikopter4.png)</w:t>
       </w:r>
     </w:p>
     <w:p>
@@ -662,7 +626,7 @@
         <w:pStyle w:val="Heading1"/>
       </w:pPr>
       <w:r>
-        <w:t>Bild 17: Raket  (raket4.png)</w:t>
+        <w:t>Bild 16: Raket  (raket4.png)</w:t>
       </w:r>
     </w:p>
     <w:p>
@@ -700,7 +664,7 @@
         <w:pStyle w:val="Heading1"/>
       </w:pPr>
       <w:r>
-        <w:t>Bild 18: Båt  (bat3.png)</w:t>
+        <w:t>Bild 17: Båt  (bat3.png)</w:t>
       </w:r>
     </w:p>
     <w:p>
@@ -736,7 +700,7 @@
         <w:pStyle w:val="Heading1"/>
       </w:pPr>
       <w:r>
-        <w:t>Bild 19: Segelbåt  (segelbat3.png)</w:t>
+        <w:t>Bild 18: Segelbåt  (segelbat3.png)</w:t>
       </w:r>
     </w:p>
     <w:p>
@@ -774,7 +738,7 @@
         <w:pStyle w:val="Heading1"/>
       </w:pPr>
       <w:r>
-        <w:t>Bild 20: Räddningsbåt  (raddningsbat2.png)</w:t>
+        <w:t>Bild 19: Räddningsbåt  (raddningsbat2.png)</w:t>
       </w:r>
     </w:p>
     <w:p>
@@ -810,7 +774,7 @@
         <w:pStyle w:val="Heading1"/>
       </w:pPr>
       <w:r>
-        <w:t>Bild 21: Lastfartyg  (lastfartyg2.png)</w:t>
+        <w:t>Bild 20: Lastfartyg  (lastfartyg2.png)</w:t>
       </w:r>
     </w:p>
     <w:p>

</xml_diff>

<commit_message>
Promptar: glassbil, gjorda bilder (brandbil6, tankbil) borttagna
Co-Authored-By: Claude Opus 5.5 (1M context) <noreply@anthropic.com>
Claude-Session: https://claude.ai/code/session_01DXzJ89FjnLPJcbSPrq5dqA
</commit_message>
<xml_diff>
--- a/promptar/bilder.docx
+++ b/promptar/bilder.docx
@@ -334,7 +334,7 @@
         <w:pStyle w:val="Heading1"/>
       </w:pPr>
       <w:r>
-        <w:t>Bild 8: Brandbil  (brandbil6.png)</w:t>
+        <w:t>Bild 8: Glassbil  (glassbil.png)</w:t>
       </w:r>
     </w:p>
     <w:p>
@@ -343,24 +343,26 @@
           <w:rFonts w:ascii="Consolas" w:hAnsi="Consolas"/>
           <w:sz w:val="19"/>
         </w:rPr>
-        <w:t>A playful but slightly more realistic picture-book illustration for small children: a red fire truck driving out of a small fire station, seen from the side at a slight three-quarter angle. Realistic proportions: a long fire truck with a cab with a big windshield and side window, a ladder on the roof with only a few wide rungs, side lockers with roll-up doors drawn as plain panels, a hose reel, blue lights on the roof, three big wheels on each side, but still friendly and softly rounded, not a toy. Landscape format 3:2, wider than tall, the whole fire truck visible with free space all around.</w:t>
+        <w:t>A playful but slightly more realistic picture-book illustration for small children: an ice cream van parked by a small park in a town on a sunny summer day, with its serving hatch open and a small awning above it, seen from the side at a slight three-quarter angle. Realistic proportions: a small delivery van with a big windshield and side window, a big serving hatch in the side with a striped awning, a big ice cream cone shape on the roof, four wheels, but still friendly and softly rounded, not a toy. Landscape format 3:2, wider than tall, the whole van visible with free space all around.</w:t>
         <w:br/>
         <w:br/>
         <w:t>Style rules (important):</w:t>
         <w:br/>
-        <w:t>- Bold, clean, smooth outlines in near-black around EVERY shape, all the same thickness, in the foreground AND the background: the fire station, trees, the street, the curb, road markings, clouds, the sun and each sun ray all get the same bold outline. No thin, light or colored lines anywhere.</w:t>
+        <w:t>- Bold, clean, smooth outlines in near-black around EVERY shape, all the same thickness, in the foreground AND the background: the park, trees, houses, the street, the curb, road markings, clouds, the sun and each sun ray all get the same bold outline. No thin, light or colored lines anywhere.</w:t>
         <w:br/>
-        <w:t>- Every area must be fully closed by outlines, no gaps. Stripes along the truck are separate areas with their own outlines.</w:t>
+        <w:t>- Every area must be fully closed by outlines, no gaps. The wide stripes on the awning (only four or five) and the colored band along the van are separate areas with their own outlines.</w:t>
         <w:br/>
         <w:t>- The street is one plain area with a few wide outlined markings, no paving tiles, no cobblestones, no grid of lines on the ground.</w:t>
+        <w:br/>
+        <w:t>- The ice cream cone on the roof is one simple shape: a cone with one big scoop, no sprinkles, no drips.</w:t>
         <w:br/>
         <w:t>- Only the outlines are black. All fill colors are lighter: tires and dark parts are medium gray, never black or dark navy.</w:t>
         <w:br/>
         <w:t>- Mostly flat colors: each area has one main color with at most a very soft, light highlight. No strong gradients, no shading bands, no dark shadows along outlines, no shadows on the ground under the vehicle.</w:t>
         <w:br/>
-        <w:t>- A bit more detail than a toy (roof lights, side mirrors, headlights, a hose reel, steps), but no tiny enclosed areas. No grilles with many slots, no ribbed or accordion details, no panel lines, bolts or rivets, no tiny chain links.</w:t>
+        <w:t>- A bit more detail than a toy (a roof cone, side mirrors, headlights, a small counter under the hatch), but no tiny enclosed areas. No grilles with many slots, no ribbed or accordion details, no panel lines, bolts or rivets, no tiny chain links.</w:t>
         <w:br/>
-        <w:t>- Background: a small friendly fire station with a big open garage door, a few simple houses, a big rounded bush or tree, light blue sky with a few big puffy clouds and a sun. Keep background objects large and simple, no other vehicles.</w:t>
+        <w:t>- Background: a small park with a big rounded tree and a bench, a few simple houses with big windows, light blue sky with a few big puffy clouds and a sun. Keep background objects large and simple, no other vehicles.</w:t>
         <w:br/>
         <w:t>- No people, no animals, no text, no letters, no numbers, no logos, no frame, no signature, no paper texture.</w:t>
       </w:r>
@@ -370,45 +372,7 @@
         <w:pStyle w:val="Heading1"/>
       </w:pPr>
       <w:r>
-        <w:t>Bild 9: Liten tankbil  (tankbil.png)</w:t>
-      </w:r>
-    </w:p>
-    <w:p>
-      <w:r>
-        <w:rPr>
-          <w:rFonts w:ascii="Consolas" w:hAnsi="Consolas"/>
-          <w:sz w:val="19"/>
-        </w:rPr>
-        <w:t>A playful but slightly more realistic picture-book illustration for small children: a small tanker truck driving along a street in a small town, seen from the side at a slight three-quarter angle. Realistic proportions: a short, small tanker truck with a cab with a big windshield and side window, one big rounded oval tank on the back with a small hatch on top, a hose rolled up at the back, two wheels on each side, but still friendly and softly rounded, not a toy. Landscape format 3:2, wider than tall, the whole tanker truck visible with free space all around.</w:t>
-        <w:br/>
-        <w:br/>
-        <w:t>Style rules (important):</w:t>
-        <w:br/>
-        <w:t>- Bold, clean, smooth outlines in near-black around EVERY shape, all the same thickness, in the foreground AND the background: houses, trees, the street, the curb, road markings, clouds, the sun and each sun ray all get the same bold outline. No thin, light or colored lines anywhere.</w:t>
-        <w:br/>
-        <w:t>- Every area must be fully closed by outlines, no gaps. The colored stripe around the tank and the stripe along the cab are separate areas with their own outlines.</w:t>
-        <w:br/>
-        <w:t>- The street is one plain area with a few wide outlined markings, no paving tiles, no cobblestones, no grid of lines on the ground.</w:t>
-        <w:br/>
-        <w:t>- The tank is one smooth rounded shape with only one or two wide colored bands, no ribs, no rivets, no reflections.</w:t>
-        <w:br/>
-        <w:t>- Only the outlines are black. All fill colors are lighter: tires and dark parts are medium gray, never black or dark navy.</w:t>
-        <w:br/>
-        <w:t>- Mostly flat colors: each area has one main color with at most a very soft, light highlight. No strong gradients, no shading bands, no dark shadows along outlines, no shadows on the ground under the vehicle.</w:t>
-        <w:br/>
-        <w:t>- A bit more detail than a toy (a beacon on the cab roof, side mirrors, headlights, a step, a small ladder at the back of the tank), but no tiny enclosed areas. No grilles with many slots, no ribbed or accordion details, no panel lines, bolts or rivets, no tiny chain links.</w:t>
-        <w:br/>
-        <w:t>- Background: a few simple houses with big windows, a big rounded bush or tree near the truck, light blue sky with a few big puffy clouds and a sun. Keep background objects large and simple, no other vehicles.</w:t>
-        <w:br/>
-        <w:t>- No people, no animals, no text, no letters, no numbers, no logos, no frame, no signature, no paper texture.</w:t>
-      </w:r>
-    </w:p>
-    <w:p>
-      <w:pPr>
-        <w:pStyle w:val="Heading1"/>
-      </w:pPr>
-      <w:r>
-        <w:t>Bild 10: Sopbil  (sopbil8.png)</w:t>
+        <w:t>Bild 9: Sopbil  (sopbil8.png)</w:t>
       </w:r>
     </w:p>
     <w:p>
@@ -444,7 +408,7 @@
         <w:pStyle w:val="Heading1"/>
       </w:pPr>
       <w:r>
-        <w:t>Bild 11: Postbil  (postbil2.png)</w:t>
+        <w:t>Bild 10: Postbil  (postbil2.png)</w:t>
       </w:r>
     </w:p>
     <w:p>
@@ -480,7 +444,7 @@
         <w:pStyle w:val="Heading1"/>
       </w:pPr>
       <w:r>
-        <w:t>Bild 12: Buss  (buss4.png)</w:t>
+        <w:t>Bild 11: Buss  (buss4.png)</w:t>
       </w:r>
     </w:p>
     <w:p>
@@ -516,7 +480,7 @@
         <w:pStyle w:val="Heading1"/>
       </w:pPr>
       <w:r>
-        <w:t>Bild 13: Tåg  (tag3.png)</w:t>
+        <w:t>Bild 12: Tåg  (tag3.png)</w:t>
       </w:r>
     </w:p>
     <w:p>
@@ -552,7 +516,7 @@
         <w:pStyle w:val="Heading1"/>
       </w:pPr>
       <w:r>
-        <w:t>Bild 14: Litet flygplan  (flygplan7.png)</w:t>
+        <w:t>Bild 13: Litet flygplan  (flygplan7.png)</w:t>
       </w:r>
     </w:p>
     <w:p>
@@ -588,7 +552,7 @@
         <w:pStyle w:val="Heading1"/>
       </w:pPr>
       <w:r>
-        <w:t>Bild 15: Helikopter  (helikopter4.png)</w:t>
+        <w:t>Bild 14: Helikopter  (helikopter4.png)</w:t>
       </w:r>
     </w:p>
     <w:p>
@@ -626,7 +590,7 @@
         <w:pStyle w:val="Heading1"/>
       </w:pPr>
       <w:r>
-        <w:t>Bild 16: Raket  (raket4.png)</w:t>
+        <w:t>Bild 15: Raket  (raket4.png)</w:t>
       </w:r>
     </w:p>
     <w:p>
@@ -664,7 +628,7 @@
         <w:pStyle w:val="Heading1"/>
       </w:pPr>
       <w:r>
-        <w:t>Bild 17: Båt  (bat3.png)</w:t>
+        <w:t>Bild 16: Båt  (bat3.png)</w:t>
       </w:r>
     </w:p>
     <w:p>
@@ -700,7 +664,7 @@
         <w:pStyle w:val="Heading1"/>
       </w:pPr>
       <w:r>
-        <w:t>Bild 18: Segelbåt  (segelbat3.png)</w:t>
+        <w:t>Bild 17: Segelbåt  (segelbat3.png)</w:t>
       </w:r>
     </w:p>
     <w:p>
@@ -738,7 +702,7 @@
         <w:pStyle w:val="Heading1"/>
       </w:pPr>
       <w:r>
-        <w:t>Bild 19: Räddningsbåt  (raddningsbat2.png)</w:t>
+        <w:t>Bild 18: Räddningsbåt  (raddningsbat2.png)</w:t>
       </w:r>
     </w:p>
     <w:p>
@@ -774,7 +738,7 @@
         <w:pStyle w:val="Heading1"/>
       </w:pPr>
       <w:r>
-        <w:t>Bild 20: Lastfartyg  (lastfartyg2.png)</w:t>
+        <w:t>Bild 19: Lastfartyg  (lastfartyg2.png)</w:t>
       </w:r>
     </w:p>
     <w:p>

</xml_diff>

<commit_message>
Ny prompt för skördetröskan med släta fält
Fältet i skördetröskorna 2-5 blev pärlband och krumelurer vid spårningen.
Nu är det stående vetet och den skördade stubben två stora släta ytor utan
linjer, utan flygande halm, och haspeln har bara fyra breda skovlar.
Glassbilen är gjord och borttagen ur dokumentet.

Co-Authored-By: Claude Opus 5.5 (1M context) <noreply@anthropic.com>
Claude-Session: https://claude.ai/code/session_01DXzJ89FjnLPJcbSPrq5dqA
</commit_message>
<xml_diff>
--- a/promptar/bilder.docx
+++ b/promptar/bilder.docx
@@ -224,7 +224,7 @@
         <w:pStyle w:val="Heading1"/>
       </w:pPr>
       <w:r>
-        <w:t>Bild 5: Skördetröska  (skordetroska2.png)</w:t>
+        <w:t>Bild 5: Skördetröska  (skordetroska6.png)</w:t>
       </w:r>
     </w:p>
     <w:p>
@@ -233,26 +233,30 @@
           <w:rFonts w:ascii="Consolas" w:hAnsi="Consolas"/>
           <w:sz w:val="19"/>
         </w:rPr>
-        <w:t>A playful but slightly more realistic picture-book illustration for small children: a big combine harvester driving through a golden wheat field on a sunny summer day, seen from the side at a slight three-quarter angle. Realistic proportions: a combine harvester with a high cab with big windows, a wide cutting header in front, an unloading pipe folded along the side, big front wheels and smaller back wheels, but still friendly and softly rounded, not a toy. Landscape format 3:2, wider than tall, the whole combine harvester visible with free space all around.</w:t>
+        <w:t>A playful but slightly more realistic picture-book illustration for small children: a big green combine harvester harvesting a golden wheat field on a sunny summer day, seen from the side at a slight three-quarter angle. In front of the harvester the wheat is still standing, behind it the field is already cut. Realistic proportions: a combine harvester with a high cab with big windows on top of a big boxy body, a wide cutting header low in front, an unloading pipe folded along the side, big front wheels and smaller back wheels, but still friendly and softly rounded, not a toy. Landscape format 3:2, wider than tall, the whole combine harvester visible with free space all around.</w:t>
         <w:br/>
         <w:br/>
         <w:t>Style rules (important):</w:t>
         <w:br/>
-        <w:t>- Bold, clean, smooth outlines in near-black around EVERY shape, all the same thickness, in the foreground AND the background: the field, hills, trees, the barn, clouds, the sun and each sun ray all get the same bold outline. No thin, light or colored lines anywhere.</w:t>
+        <w:t>- Bold, clean, smooth outlines in near-black around EVERY shape, all the same thickness, in the foreground AND the background: the edge of the standing wheat, the cut field, the hills, the tree, the barn, clouds, the sun and each sun ray all get the same bold outline. No thin, light or colored lines anywhere.</w:t>
         <w:br/>
-        <w:t>- Every area must be fully closed by outlines, no gaps. Stripes on the harvester and the parts of the header are separate areas with their own outlines.</w:t>
+        <w:t>- Every area must be fully closed by outlines, no gaps. Stripes on the harvester, the reel and the parts of the header are separate areas with their own outlines.</w:t>
         <w:br/>
-        <w:t>- The wheat field is one large smooth area of golden yellow with a few bold outlined wave lines, no single straws, no ears of wheat, no rows.</w:t>
+        <w:t>- The standing wheat is ONE large smooth area of golden yellow with a smooth, gently wavy top edge, no lines inside it at all: no wave lines, no single straws, no ears of wheat, no rows.</w:t>
         <w:br/>
-        <w:t>- The header has a few large smooth parts, no many teeth, no reel with many thin bars.</w:t>
+        <w:t>- The cut field behind the harvester is ONE large smooth area of pale beige, no stubble, no lines, no rows, no tracks.</w:t>
+        <w:br/>
+        <w:t>- No flying straw, chaff, dust or grain anywhere, nothing coming out of the harvester.</w:t>
+        <w:br/>
+        <w:t>- The header is one wide smooth box with a big reel above it drawn as a simple cylinder with only four wide flat paddles, no teeth, no thin bars, no spikes, no auger spiral.</w:t>
         <w:br/>
         <w:t>- Only the outlines are black. All fill colors are lighter: tires and dark parts are medium gray, never black or dark navy.</w:t>
         <w:br/>
         <w:t>- Mostly flat colors: each area has one main color with at most a very soft, light highlight. No strong gradients, no shading bands, no dark shadows along outlines, no shadows on the ground under the vehicle.</w:t>
         <w:br/>
-        <w:t>- A bit more detail than a toy (a beacon on the cab roof, side mirrors, headlights, a ladder up to the cab, a colored stripe along the body), but no tiny enclosed areas. No grilles with many slots, no ribbed or accordion details, no panel lines, bolts or rivets, no tiny chain links.</w:t>
+        <w:t>- A bit more detail than a toy (a beacon on the cab roof, side mirrors, two headlights, a ladder up to the cab, one wide colored stripe along the body), but no tiny enclosed areas. No grilles with many slots, no ribbed or accordion details, no panel lines, bolts or rivets, no tiny chain links.</w:t>
         <w:br/>
-        <w:t>- Background: soft rolling green hills, a red barn, a big rounded tree, light blue sky with a few big puffy clouds and a sun. Keep background objects large and simple, no other vehicles.</w:t>
+        <w:t>- Background: soft rolling green hills, a red barn with a big door, one big rounded tree, light blue sky with a few big puffy clouds and a sun. Keep background objects large and simple, no other vehicles.</w:t>
         <w:br/>
         <w:t>- No people, no animals, no text, no letters, no numbers, no logos, no frame, no signature, no paper texture.</w:t>
       </w:r>
@@ -334,45 +338,7 @@
         <w:pStyle w:val="Heading1"/>
       </w:pPr>
       <w:r>
-        <w:t>Bild 8: Glassbil  (glassbil.png)</w:t>
-      </w:r>
-    </w:p>
-    <w:p>
-      <w:r>
-        <w:rPr>
-          <w:rFonts w:ascii="Consolas" w:hAnsi="Consolas"/>
-          <w:sz w:val="19"/>
-        </w:rPr>
-        <w:t>A playful but slightly more realistic picture-book illustration for small children: an ice cream van parked by a small park in a town on a sunny summer day, with its serving hatch open and a small awning above it, seen from the side at a slight three-quarter angle. Realistic proportions: a small delivery van with a big windshield and side window, a big serving hatch in the side with a striped awning, a big ice cream cone shape on the roof, four wheels, but still friendly and softly rounded, not a toy. Landscape format 3:2, wider than tall, the whole van visible with free space all around.</w:t>
-        <w:br/>
-        <w:br/>
-        <w:t>Style rules (important):</w:t>
-        <w:br/>
-        <w:t>- Bold, clean, smooth outlines in near-black around EVERY shape, all the same thickness, in the foreground AND the background: the park, trees, houses, the street, the curb, road markings, clouds, the sun and each sun ray all get the same bold outline. No thin, light or colored lines anywhere.</w:t>
-        <w:br/>
-        <w:t>- Every area must be fully closed by outlines, no gaps. The wide stripes on the awning (only four or five) and the colored band along the van are separate areas with their own outlines.</w:t>
-        <w:br/>
-        <w:t>- The street is one plain area with a few wide outlined markings, no paving tiles, no cobblestones, no grid of lines on the ground.</w:t>
-        <w:br/>
-        <w:t>- The ice cream cone on the roof is one simple shape: a cone with one big scoop, no sprinkles, no drips.</w:t>
-        <w:br/>
-        <w:t>- Only the outlines are black. All fill colors are lighter: tires and dark parts are medium gray, never black or dark navy.</w:t>
-        <w:br/>
-        <w:t>- Mostly flat colors: each area has one main color with at most a very soft, light highlight. No strong gradients, no shading bands, no dark shadows along outlines, no shadows on the ground under the vehicle.</w:t>
-        <w:br/>
-        <w:t>- A bit more detail than a toy (a roof cone, side mirrors, headlights, a small counter under the hatch), but no tiny enclosed areas. No grilles with many slots, no ribbed or accordion details, no panel lines, bolts or rivets, no tiny chain links.</w:t>
-        <w:br/>
-        <w:t>- Background: a small park with a big rounded tree and a bench, a few simple houses with big windows, light blue sky with a few big puffy clouds and a sun. Keep background objects large and simple, no other vehicles.</w:t>
-        <w:br/>
-        <w:t>- No people, no animals, no text, no letters, no numbers, no logos, no frame, no signature, no paper texture.</w:t>
-      </w:r>
-    </w:p>
-    <w:p>
-      <w:pPr>
-        <w:pStyle w:val="Heading1"/>
-      </w:pPr>
-      <w:r>
-        <w:t>Bild 9: Sopbil  (sopbil8.png)</w:t>
+        <w:t>Bild 8: Sopbil  (sopbil8.png)</w:t>
       </w:r>
     </w:p>
     <w:p>
@@ -408,7 +374,7 @@
         <w:pStyle w:val="Heading1"/>
       </w:pPr>
       <w:r>
-        <w:t>Bild 10: Postbil  (postbil2.png)</w:t>
+        <w:t>Bild 9: Postbil  (postbil2.png)</w:t>
       </w:r>
     </w:p>
     <w:p>
@@ -444,7 +410,7 @@
         <w:pStyle w:val="Heading1"/>
       </w:pPr>
       <w:r>
-        <w:t>Bild 11: Buss  (buss4.png)</w:t>
+        <w:t>Bild 10: Buss  (buss4.png)</w:t>
       </w:r>
     </w:p>
     <w:p>
@@ -480,7 +446,7 @@
         <w:pStyle w:val="Heading1"/>
       </w:pPr>
       <w:r>
-        <w:t>Bild 12: Tåg  (tag3.png)</w:t>
+        <w:t>Bild 11: Tåg  (tag3.png)</w:t>
       </w:r>
     </w:p>
     <w:p>
@@ -516,7 +482,7 @@
         <w:pStyle w:val="Heading1"/>
       </w:pPr>
       <w:r>
-        <w:t>Bild 13: Litet flygplan  (flygplan7.png)</w:t>
+        <w:t>Bild 12: Litet flygplan  (flygplan7.png)</w:t>
       </w:r>
     </w:p>
     <w:p>
@@ -552,7 +518,7 @@
         <w:pStyle w:val="Heading1"/>
       </w:pPr>
       <w:r>
-        <w:t>Bild 14: Helikopter  (helikopter4.png)</w:t>
+        <w:t>Bild 13: Helikopter  (helikopter4.png)</w:t>
       </w:r>
     </w:p>
     <w:p>
@@ -590,7 +556,7 @@
         <w:pStyle w:val="Heading1"/>
       </w:pPr>
       <w:r>
-        <w:t>Bild 15: Raket  (raket4.png)</w:t>
+        <w:t>Bild 14: Raket  (raket4.png)</w:t>
       </w:r>
     </w:p>
     <w:p>
@@ -628,7 +594,7 @@
         <w:pStyle w:val="Heading1"/>
       </w:pPr>
       <w:r>
-        <w:t>Bild 16: Båt  (bat3.png)</w:t>
+        <w:t>Bild 15: Båt  (bat3.png)</w:t>
       </w:r>
     </w:p>
     <w:p>
@@ -664,7 +630,7 @@
         <w:pStyle w:val="Heading1"/>
       </w:pPr>
       <w:r>
-        <w:t>Bild 17: Segelbåt  (segelbat3.png)</w:t>
+        <w:t>Bild 16: Segelbåt  (segelbat3.png)</w:t>
       </w:r>
     </w:p>
     <w:p>
@@ -702,7 +668,7 @@
         <w:pStyle w:val="Heading1"/>
       </w:pPr>
       <w:r>
-        <w:t>Bild 18: Räddningsbåt  (raddningsbat2.png)</w:t>
+        <w:t>Bild 17: Räddningsbåt  (raddningsbat2.png)</w:t>
       </w:r>
     </w:p>
     <w:p>
@@ -738,7 +704,7 @@
         <w:pStyle w:val="Heading1"/>
       </w:pPr>
       <w:r>
-        <w:t>Bild 19: Lastfartyg  (lastfartyg2.png)</w:t>
+        <w:t>Bild 18: Lastfartyg  (lastfartyg2.png)</w:t>
       </w:r>
     </w:p>
     <w:p>

</xml_diff>